<commit_message>
docs(engse601): update S1-B component diagram
</commit_message>
<xml_diff>
--- a/01-plan/S1-B_PP.docx
+++ b/01-plan/S1-B_PP.docx
@@ -721,28 +721,71 @@
               <w:t>สร้างย้อนหลัง 23 ต.ค. 2026 จากโค้ด snapshot bd303e8</w:t>
               <w:br/>
               <w:br/>
-              <w:t>Presentation: AcknowledgementsPage</w:t>
+              <w:t> </w:t>
               <w:br/>
-              <w:t xml:space="preserve">        ↓ HTTP + session / assignmentId</w:t>
+              <w:t xml:space="preserve"> </w:t>
               <w:br/>
-              <w:t>Route: acknowledgementRoutes → Controller</w:t>
+              <w:t> </w:t>
               <w:br/>
-              <w:t xml:space="preserve">        ↓</w:t>
+              <w:t xml:space="preserve"> </w:t>
               <w:br/>
-              <w:t>Application: acknowledgementService.confirm</w:t>
+              <w:t> </w:t>
               <w:br/>
-              <w:t>ตรวจ active user / assignee / published version / read access</w:t>
+              <w:t> </w:t>
               <w:br/>
-              <w:t xml:space="preserve">        ↓ ค้น EXPORT ของผู้รับ + ไฟล์ฉบับนี้ + เวลา &gt;= assignedAt</w:t>
+              <w:t xml:space="preserve"> </w:t>
               <w:br/>
-              <w:t>Data: Prisma transaction → Confirmation + ACKNOWLEDGE</w:t>
+              <w:t> </w:t>
               <w:br/>
-              <w:t xml:space="preserve">        ↑ คืนผลเดิมเมื่อยืนยันซ้ำ</w:t>
+              <w:t xml:space="preserve"> </w:t>
               <w:br/>
               <w:br/>
-              <w:t>การดาวน์โหลด: documentService.getDocumentFile → ตรวจสิทธิ์/ไฟล์ → EXPORT</w:t>
+              <w:t> </w:t>
               <w:br/>
-              <w:t>UI ช่วยนำทาง; กฎบังคับจริงอยู่ confirm ฝั่ง API ไม่ใช่การซ่อนปุ่ม</w:t>
+              <w:t> </w:t>
+              <w:drawing>
+                <wp:anchor xmlns:a="http://schemas.openxmlformats.org/drawingml/2006/main" xmlns:pic="http://schemas.openxmlformats.org/drawingml/2006/picture" distT="0" distB="0" distL="0" distR="0" simplePos="0" relativeHeight="0" behindDoc="0" locked="0" layoutInCell="1" allowOverlap="1">
+                  <wp:simplePos x="0" y="0"/>
+                  <wp:positionH relativeFrom="column">
+                    <wp:posOffset>0</wp:posOffset>
+                  </wp:positionH>
+                  <wp:positionV relativeFrom="paragraph">
+                    <wp:posOffset>457200</wp:posOffset>
+                  </wp:positionV>
+                  <wp:extent cx="5522976" cy="2117140"/>
+                  <wp:effectExtent l="0" t="0" r="0" b="0"/>
+                  <wp:wrapNone/>
+                  <wp:docPr id="1" name="S1 acknowledgement component and data-flow diagram" descr="Retrospective source-verified map at bd303e8; confirms API enforcement of BR-A-07, the prior EXPORT check, and transactional acknowledgement writes."/>
+                  <wp:cNvGraphicFramePr>
+                    <a:graphicFrameLocks noChangeAspect="1"/>
+                  </wp:cNvGraphicFramePr>
+                  <a:graphic>
+                    <a:graphicData uri="http://schemas.openxmlformats.org/drawingml/2006/picture">
+                      <pic:pic>
+                        <pic:nvPicPr>
+                          <pic:cNvPr id="1" name="s1-ack-component-diagram.png"/>
+                          <pic:cNvPicPr/>
+                        </pic:nvPicPr>
+                        <pic:blipFill>
+                          <a:blip r:embed="rId10"/>
+                          <a:stretch>
+                            <a:fillRect/>
+                          </a:stretch>
+                        </pic:blipFill>
+                        <pic:spPr>
+                          <a:xfrm>
+                            <a:off x="0" y="0"/>
+                            <a:ext cx="5522976" cy="2117140"/>
+                          </a:xfrm>
+                          <a:prstGeom prst="rect">
+                            <a:avLst/>
+                          </a:prstGeom>
+                        </pic:spPr>
+                      </pic:pic>
+                    </a:graphicData>
+                  </a:graphic>
+                </wp:anchor>
+              </w:drawing>
             </w:r>
           </w:p>
         </w:tc>

</xml_diff>